<commit_message>
Shorten both lab reports to 19 pages and refresh submission bundles
</commit_message>
<xml_diff>
--- a/submission/Lab1_Andreus_85/reference.docx
+++ b/submission/Lab1_Andreus_85/reference.docx
@@ -391,12 +391,13 @@
     <w:qFormat/>
     <w:rsid w:val="00FC693F"/>
     <w:pPr>
-      <w:spacing w:after="120" w:line="360" w:lineRule="auto"/>
+      <w:spacing w:after="60" w:line="360" w:lineRule="auto" w:before="0"/>
       <w:ind w:firstLine="709"/>
       <w:jc w:val="both"/>
     </w:pPr>
     <w:rPr>
-      <w:rFonts w:ascii="Times New Roman" w:hAnsi="Times New Roman" w:eastAsia="Times New Roman"/>
+      <w:rFonts w:ascii="Times New Roman" w:hAnsi="Times New Roman" w:eastAsia="Times New Roman" w:cs="Times New Roman"/>
+      <w:color w:val="000000"/>
       <w:sz w:val="28"/>
     </w:rPr>
   </w:style>
@@ -412,8 +413,13 @@
         <w:tab w:val="center" w:pos="4680"/>
         <w:tab w:val="right" w:pos="9360"/>
       </w:tabs>
-      <w:spacing w:after="0" w:line="240" w:lineRule="auto"/>
-    </w:pPr>
+      <w:spacing w:after="60" w:line="276" w:lineRule="auto" w:before="0"/>
+    </w:pPr>
+    <w:rPr>
+      <w:rFonts w:ascii="Times New Roman" w:hAnsi="Times New Roman" w:eastAsia="Times New Roman" w:cs="Times New Roman"/>
+      <w:color w:val="000000"/>
+      <w:sz w:val="28"/>
+    </w:rPr>
   </w:style>
   <w:style w:type="character" w:customStyle="1" w:styleId="HeaderChar">
     <w:name w:val="Header Char"/>
@@ -434,12 +440,13 @@
         <w:tab w:val="center" w:pos="4680"/>
         <w:tab w:val="right" w:pos="9360"/>
       </w:tabs>
-      <w:spacing w:after="120" w:line="360" w:lineRule="auto"/>
+      <w:spacing w:after="60" w:line="276" w:lineRule="auto" w:before="0"/>
       <w:ind w:firstLine="709"/>
       <w:jc w:val="both"/>
     </w:pPr>
     <w:rPr>
-      <w:rFonts w:ascii="Times New Roman" w:hAnsi="Times New Roman" w:eastAsia="Times New Roman"/>
+      <w:rFonts w:ascii="Times New Roman" w:hAnsi="Times New Roman" w:eastAsia="Times New Roman" w:cs="Times New Roman"/>
+      <w:color w:val="000000"/>
       <w:sz w:val="28"/>
     </w:rPr>
   </w:style>
@@ -461,16 +468,16 @@
     <w:pPr>
       <w:keepNext/>
       <w:keepLines/>
-      <w:spacing w:before="480" w:after="120" w:line="360" w:lineRule="auto"/>
+      <w:spacing w:before="120" w:after="60" w:line="276" w:lineRule="auto"/>
       <w:ind w:firstLine="0"/>
       <w:jc w:val="both"/>
       <w:outlineLvl w:val="0"/>
     </w:pPr>
     <w:rPr>
-      <w:rFonts w:asciiTheme="majorHAnsi" w:eastAsiaTheme="majorEastAsia" w:hAnsiTheme="majorHAnsi" w:cstheme="majorBidi" w:ascii="Times New Roman" w:hAnsi="Times New Roman" w:eastAsia="Times New Roman"/>
+      <w:rFonts w:cstheme="majorBidi" w:ascii="Times New Roman" w:hAnsi="Times New Roman" w:eastAsia="Times New Roman" w:cs="Times New Roman"/>
       <w:b/>
       <w:bCs/>
-      <w:color w:val="365F91" w:themeColor="accent1" w:themeShade="BF"/>
+      <w:color w:val="000000"/>
       <w:sz w:val="28"/>
       <w:szCs w:val="28"/>
     </w:rPr>
@@ -487,16 +494,16 @@
     <w:pPr>
       <w:keepNext/>
       <w:keepLines/>
-      <w:spacing w:before="200" w:after="120" w:line="360" w:lineRule="auto"/>
+      <w:spacing w:before="120" w:after="60" w:line="276" w:lineRule="auto"/>
       <w:ind w:firstLine="0"/>
       <w:jc w:val="both"/>
       <w:outlineLvl w:val="1"/>
     </w:pPr>
     <w:rPr>
-      <w:rFonts w:asciiTheme="majorHAnsi" w:eastAsiaTheme="majorEastAsia" w:hAnsiTheme="majorHAnsi" w:cstheme="majorBidi" w:ascii="Times New Roman" w:hAnsi="Times New Roman" w:eastAsia="Times New Roman"/>
+      <w:rFonts w:cstheme="majorBidi" w:ascii="Times New Roman" w:hAnsi="Times New Roman" w:eastAsia="Times New Roman" w:cs="Times New Roman"/>
       <w:b/>
       <w:bCs/>
-      <w:color w:val="4F81BD" w:themeColor="accent1"/>
+      <w:color w:val="000000"/>
       <w:sz w:val="28"/>
       <w:szCs w:val="26"/>
     </w:rPr>
@@ -513,16 +520,16 @@
     <w:pPr>
       <w:keepNext/>
       <w:keepLines/>
-      <w:spacing w:before="200" w:after="120" w:line="360" w:lineRule="auto"/>
+      <w:spacing w:before="120" w:after="60" w:line="276" w:lineRule="auto"/>
       <w:ind w:firstLine="0"/>
       <w:jc w:val="both"/>
       <w:outlineLvl w:val="2"/>
     </w:pPr>
     <w:rPr>
-      <w:rFonts w:asciiTheme="majorHAnsi" w:eastAsiaTheme="majorEastAsia" w:hAnsiTheme="majorHAnsi" w:cstheme="majorBidi" w:ascii="Times New Roman" w:hAnsi="Times New Roman" w:eastAsia="Times New Roman"/>
+      <w:rFonts w:cstheme="majorBidi" w:ascii="Times New Roman" w:hAnsi="Times New Roman" w:eastAsia="Times New Roman" w:cs="Times New Roman"/>
       <w:b/>
       <w:bCs/>
-      <w:color w:val="4F81BD" w:themeColor="accent1"/>
+      <w:color w:val="000000"/>
       <w:sz w:val="28"/>
     </w:rPr>
   </w:style>
@@ -539,16 +546,17 @@
     <w:pPr>
       <w:keepNext/>
       <w:keepLines/>
-      <w:spacing w:before="200" w:after="0"/>
+      <w:spacing w:before="120" w:after="60" w:line="276" w:lineRule="auto"/>
       <w:outlineLvl w:val="3"/>
     </w:pPr>
     <w:rPr>
-      <w:rFonts w:asciiTheme="majorHAnsi" w:eastAsiaTheme="majorEastAsia" w:hAnsiTheme="majorHAnsi" w:cstheme="majorBidi"/>
+      <w:rFonts w:cstheme="majorBidi" w:ascii="Times New Roman" w:hAnsi="Times New Roman" w:eastAsia="Times New Roman" w:cs="Times New Roman"/>
       <w:b/>
       <w:bCs/>
       <w:i/>
       <w:iCs/>
-      <w:color w:val="4F81BD" w:themeColor="accent1"/>
+      <w:color w:val="000000"/>
+      <w:sz w:val="28"/>
     </w:rPr>
   </w:style>
   <w:style w:type="paragraph" w:styleId="Heading5">
@@ -564,12 +572,13 @@
     <w:pPr>
       <w:keepNext/>
       <w:keepLines/>
-      <w:spacing w:before="200" w:after="0"/>
+      <w:spacing w:before="120" w:after="60" w:line="276" w:lineRule="auto"/>
       <w:outlineLvl w:val="4"/>
     </w:pPr>
     <w:rPr>
-      <w:rFonts w:asciiTheme="majorHAnsi" w:eastAsiaTheme="majorEastAsia" w:hAnsiTheme="majorHAnsi" w:cstheme="majorBidi"/>
-      <w:color w:val="243F60" w:themeColor="accent1" w:themeShade="7F"/>
+      <w:rFonts w:cstheme="majorBidi" w:ascii="Times New Roman" w:hAnsi="Times New Roman" w:eastAsia="Times New Roman" w:cs="Times New Roman"/>
+      <w:color w:val="000000"/>
+      <w:sz w:val="28"/>
     </w:rPr>
   </w:style>
   <w:style w:type="paragraph" w:styleId="Heading6">
@@ -585,14 +594,15 @@
     <w:pPr>
       <w:keepNext/>
       <w:keepLines/>
-      <w:spacing w:before="200" w:after="0"/>
+      <w:spacing w:before="120" w:after="60" w:line="276" w:lineRule="auto"/>
       <w:outlineLvl w:val="5"/>
     </w:pPr>
     <w:rPr>
-      <w:rFonts w:asciiTheme="majorHAnsi" w:eastAsiaTheme="majorEastAsia" w:hAnsiTheme="majorHAnsi" w:cstheme="majorBidi"/>
+      <w:rFonts w:cstheme="majorBidi" w:ascii="Times New Roman" w:hAnsi="Times New Roman" w:eastAsia="Times New Roman" w:cs="Times New Roman"/>
       <w:i/>
       <w:iCs/>
-      <w:color w:val="243F60" w:themeColor="accent1" w:themeShade="7F"/>
+      <w:color w:val="000000"/>
+      <w:sz w:val="28"/>
     </w:rPr>
   </w:style>
   <w:style w:type="paragraph" w:styleId="Heading7">
@@ -608,14 +618,15 @@
     <w:pPr>
       <w:keepNext/>
       <w:keepLines/>
-      <w:spacing w:before="200" w:after="0"/>
+      <w:spacing w:before="120" w:after="60" w:line="276" w:lineRule="auto"/>
       <w:outlineLvl w:val="6"/>
     </w:pPr>
     <w:rPr>
-      <w:rFonts w:asciiTheme="majorHAnsi" w:eastAsiaTheme="majorEastAsia" w:hAnsiTheme="majorHAnsi" w:cstheme="majorBidi"/>
+      <w:rFonts w:cstheme="majorBidi" w:ascii="Times New Roman" w:hAnsi="Times New Roman" w:eastAsia="Times New Roman" w:cs="Times New Roman"/>
       <w:i/>
       <w:iCs/>
-      <w:color w:val="404040" w:themeColor="text1" w:themeTint="BF"/>
+      <w:color w:val="000000"/>
+      <w:sz w:val="28"/>
     </w:rPr>
   </w:style>
   <w:style w:type="paragraph" w:styleId="Heading8">
@@ -631,13 +642,13 @@
     <w:pPr>
       <w:keepNext/>
       <w:keepLines/>
-      <w:spacing w:before="200" w:after="0"/>
+      <w:spacing w:before="120" w:after="60" w:line="276" w:lineRule="auto"/>
       <w:outlineLvl w:val="7"/>
     </w:pPr>
     <w:rPr>
-      <w:rFonts w:asciiTheme="majorHAnsi" w:eastAsiaTheme="majorEastAsia" w:hAnsiTheme="majorHAnsi" w:cstheme="majorBidi"/>
-      <w:color w:val="4F81BD" w:themeColor="accent1"/>
-      <w:sz w:val="20"/>
+      <w:rFonts w:cstheme="majorBidi" w:ascii="Times New Roman" w:hAnsi="Times New Roman" w:eastAsia="Times New Roman" w:cs="Times New Roman"/>
+      <w:color w:val="000000"/>
+      <w:sz w:val="28"/>
       <w:szCs w:val="20"/>
     </w:rPr>
   </w:style>
@@ -654,15 +665,15 @@
     <w:pPr>
       <w:keepNext/>
       <w:keepLines/>
-      <w:spacing w:before="200" w:after="0"/>
+      <w:spacing w:before="120" w:after="60" w:line="276" w:lineRule="auto"/>
       <w:outlineLvl w:val="8"/>
     </w:pPr>
     <w:rPr>
-      <w:rFonts w:asciiTheme="majorHAnsi" w:eastAsiaTheme="majorEastAsia" w:hAnsiTheme="majorHAnsi" w:cstheme="majorBidi"/>
+      <w:rFonts w:cstheme="majorBidi" w:ascii="Times New Roman" w:hAnsi="Times New Roman" w:eastAsia="Times New Roman" w:cs="Times New Roman"/>
       <w:i/>
       <w:iCs/>
-      <w:color w:val="404040" w:themeColor="text1" w:themeTint="BF"/>
-      <w:sz w:val="20"/>
+      <w:color w:val="000000"/>
+      <w:sz w:val="28"/>
       <w:szCs w:val="20"/>
     </w:rPr>
   </w:style>
@@ -699,8 +710,13 @@
     <w:qFormat/>
     <w:rsid w:val="00FC693F"/>
     <w:pPr>
-      <w:spacing w:after="0" w:line="240" w:lineRule="auto"/>
-    </w:pPr>
+      <w:spacing w:after="60" w:line="276" w:lineRule="auto" w:before="0"/>
+    </w:pPr>
+    <w:rPr>
+      <w:rFonts w:ascii="Times New Roman" w:hAnsi="Times New Roman" w:eastAsia="Times New Roman" w:cs="Times New Roman"/>
+      <w:color w:val="000000"/>
+      <w:sz w:val="28"/>
+    </w:rPr>
   </w:style>
   <w:style w:type="character" w:customStyle="1" w:styleId="Heading1Char">
     <w:name w:val="Heading 1 Char"/>
@@ -757,14 +773,14 @@
       <w:pBdr>
         <w:bottom w:val="single" w:sz="8" w:space="4" w:color="4F81BD" w:themeColor="accent1"/>
       </w:pBdr>
-      <w:spacing w:after="480" w:line="360" w:lineRule="auto"/>
+      <w:spacing w:after="480" w:line="276" w:lineRule="auto" w:before="0"/>
       <w:ind w:firstLine="0"/>
       <w:contextualSpacing/>
       <w:jc w:val="center"/>
     </w:pPr>
     <w:rPr>
-      <w:rFonts w:asciiTheme="majorHAnsi" w:eastAsiaTheme="majorEastAsia" w:hAnsiTheme="majorHAnsi" w:cstheme="majorBidi" w:ascii="Times New Roman" w:hAnsi="Times New Roman" w:eastAsia="Times New Roman"/>
-      <w:color w:val="17365D" w:themeColor="text2" w:themeShade="BF"/>
+      <w:rFonts w:cstheme="majorBidi" w:ascii="Times New Roman" w:hAnsi="Times New Roman" w:eastAsia="Times New Roman" w:cs="Times New Roman"/>
+      <w:color w:val="000000"/>
       <w:spacing w:val="5"/>
       <w:kern w:val="28"/>
       <w:sz w:val="28"/>
@@ -798,15 +814,15 @@
       <w:numPr>
         <w:ilvl w:val="1"/>
       </w:numPr>
-      <w:spacing w:after="480" w:line="360" w:lineRule="auto"/>
+      <w:spacing w:after="480" w:line="276" w:lineRule="auto" w:before="0"/>
       <w:ind w:firstLine="0"/>
       <w:jc w:val="center"/>
     </w:pPr>
     <w:rPr>
-      <w:rFonts w:asciiTheme="majorHAnsi" w:eastAsiaTheme="majorEastAsia" w:hAnsiTheme="majorHAnsi" w:cstheme="majorBidi" w:ascii="Times New Roman" w:hAnsi="Times New Roman" w:eastAsia="Times New Roman"/>
+      <w:rFonts w:cstheme="majorBidi" w:ascii="Times New Roman" w:hAnsi="Times New Roman" w:eastAsia="Times New Roman" w:cs="Times New Roman"/>
       <w:i/>
       <w:iCs/>
-      <w:color w:val="4F81BD" w:themeColor="accent1"/>
+      <w:color w:val="000000"/>
       <w:spacing w:val="15"/>
       <w:sz w:val="28"/>
       <w:szCs w:val="24"/>
@@ -835,9 +851,15 @@
     <w:qFormat/>
     <w:rsid w:val="00FC693F"/>
     <w:pPr>
+      <w:spacing w:line="276" w:lineRule="auto" w:before="0" w:after="60"/>
       <w:ind w:left="720"/>
       <w:contextualSpacing/>
     </w:pPr>
+    <w:rPr>
+      <w:rFonts w:ascii="Times New Roman" w:hAnsi="Times New Roman" w:eastAsia="Times New Roman" w:cs="Times New Roman"/>
+      <w:color w:val="000000"/>
+      <w:sz w:val="28"/>
+    </w:rPr>
   </w:style>
   <w:style w:type="paragraph" w:styleId="BodyText">
     <w:name w:val="Body Text"/>
@@ -847,12 +869,13 @@
     <w:unhideWhenUsed/>
     <w:rsid w:val="00AA1D8D"/>
     <w:pPr>
-      <w:spacing w:after="120" w:line="360" w:lineRule="auto"/>
+      <w:spacing w:after="60" w:line="360" w:lineRule="auto" w:before="0"/>
       <w:ind w:firstLine="709"/>
       <w:jc w:val="both"/>
     </w:pPr>
     <w:rPr>
-      <w:rFonts w:ascii="Times New Roman" w:hAnsi="Times New Roman" w:eastAsia="Times New Roman"/>
+      <w:rFonts w:ascii="Times New Roman" w:hAnsi="Times New Roman" w:eastAsia="Times New Roman" w:cs="Times New Roman"/>
+      <w:color w:val="000000"/>
       <w:sz w:val="28"/>
     </w:rPr>
   </w:style>
@@ -871,8 +894,13 @@
     <w:unhideWhenUsed/>
     <w:rsid w:val="00AA1D8D"/>
     <w:pPr>
-      <w:spacing w:after="120" w:line="480" w:lineRule="auto"/>
-    </w:pPr>
+      <w:spacing w:after="60" w:line="276" w:lineRule="auto" w:before="0"/>
+    </w:pPr>
+    <w:rPr>
+      <w:rFonts w:ascii="Times New Roman" w:hAnsi="Times New Roman" w:eastAsia="Times New Roman" w:cs="Times New Roman"/>
+      <w:color w:val="000000"/>
+      <w:sz w:val="28"/>
+    </w:rPr>
   </w:style>
   <w:style w:type="character" w:customStyle="1" w:styleId="BodyText2Char">
     <w:name w:val="Body Text 2 Char"/>
@@ -889,10 +917,12 @@
     <w:unhideWhenUsed/>
     <w:rsid w:val="00AA1D8D"/>
     <w:pPr>
-      <w:spacing w:after="120"/>
+      <w:spacing w:after="60" w:line="276" w:lineRule="auto" w:before="0"/>
     </w:pPr>
     <w:rPr>
-      <w:sz w:val="16"/>
+      <w:rFonts w:ascii="Times New Roman" w:hAnsi="Times New Roman" w:eastAsia="Times New Roman" w:cs="Times New Roman"/>
+      <w:color w:val="000000"/>
+      <w:sz w:val="28"/>
       <w:szCs w:val="16"/>
     </w:rPr>
   </w:style>
@@ -914,9 +944,15 @@
     <w:unhideWhenUsed/>
     <w:rsid w:val="00AA1D8D"/>
     <w:pPr>
+      <w:spacing w:line="276" w:lineRule="auto" w:before="0" w:after="60"/>
       <w:ind w:left="360" w:hanging="360"/>
       <w:contextualSpacing/>
     </w:pPr>
+    <w:rPr>
+      <w:rFonts w:ascii="Times New Roman" w:hAnsi="Times New Roman" w:eastAsia="Times New Roman" w:cs="Times New Roman"/>
+      <w:color w:val="000000"/>
+      <w:sz w:val="28"/>
+    </w:rPr>
   </w:style>
   <w:style w:type="paragraph" w:styleId="List2">
     <w:name w:val="List 2"/>
@@ -925,9 +961,15 @@
     <w:unhideWhenUsed/>
     <w:rsid w:val="00326F90"/>
     <w:pPr>
+      <w:spacing w:line="276" w:lineRule="auto" w:before="0" w:after="60"/>
       <w:ind w:left="720" w:hanging="360"/>
       <w:contextualSpacing/>
     </w:pPr>
+    <w:rPr>
+      <w:rFonts w:ascii="Times New Roman" w:hAnsi="Times New Roman" w:eastAsia="Times New Roman" w:cs="Times New Roman"/>
+      <w:color w:val="000000"/>
+      <w:sz w:val="28"/>
+    </w:rPr>
   </w:style>
   <w:style w:type="paragraph" w:styleId="List3">
     <w:name w:val="List 3"/>
@@ -936,9 +978,15 @@
     <w:unhideWhenUsed/>
     <w:rsid w:val="00326F90"/>
     <w:pPr>
+      <w:spacing w:line="276" w:lineRule="auto" w:before="0" w:after="60"/>
       <w:ind w:left="1080" w:hanging="360"/>
       <w:contextualSpacing/>
     </w:pPr>
+    <w:rPr>
+      <w:rFonts w:ascii="Times New Roman" w:hAnsi="Times New Roman" w:eastAsia="Times New Roman" w:cs="Times New Roman"/>
+      <w:color w:val="000000"/>
+      <w:sz w:val="28"/>
+    </w:rPr>
   </w:style>
   <w:style w:type="paragraph" w:styleId="ListBullet">
     <w:name w:val="List Bullet"/>
@@ -950,8 +998,14 @@
       <w:numPr>
         <w:numId w:val="1"/>
       </w:numPr>
+      <w:spacing w:line="276" w:lineRule="auto" w:before="0" w:after="60"/>
       <w:contextualSpacing/>
     </w:pPr>
+    <w:rPr>
+      <w:rFonts w:ascii="Times New Roman" w:hAnsi="Times New Roman" w:eastAsia="Times New Roman" w:cs="Times New Roman"/>
+      <w:color w:val="000000"/>
+      <w:sz w:val="28"/>
+    </w:rPr>
   </w:style>
   <w:style w:type="paragraph" w:styleId="ListBullet2">
     <w:name w:val="List Bullet 2"/>
@@ -963,8 +1017,14 @@
       <w:numPr>
         <w:numId w:val="2"/>
       </w:numPr>
+      <w:spacing w:line="276" w:lineRule="auto" w:before="0" w:after="60"/>
       <w:contextualSpacing/>
     </w:pPr>
+    <w:rPr>
+      <w:rFonts w:ascii="Times New Roman" w:hAnsi="Times New Roman" w:eastAsia="Times New Roman" w:cs="Times New Roman"/>
+      <w:color w:val="000000"/>
+      <w:sz w:val="28"/>
+    </w:rPr>
   </w:style>
   <w:style w:type="paragraph" w:styleId="ListBullet3">
     <w:name w:val="List Bullet 3"/>
@@ -976,8 +1036,14 @@
       <w:numPr>
         <w:numId w:val="3"/>
       </w:numPr>
+      <w:spacing w:line="276" w:lineRule="auto" w:before="0" w:after="60"/>
       <w:contextualSpacing/>
     </w:pPr>
+    <w:rPr>
+      <w:rFonts w:ascii="Times New Roman" w:hAnsi="Times New Roman" w:eastAsia="Times New Roman" w:cs="Times New Roman"/>
+      <w:color w:val="000000"/>
+      <w:sz w:val="28"/>
+    </w:rPr>
   </w:style>
   <w:style w:type="paragraph" w:styleId="ListNumber">
     <w:name w:val="List Number"/>
@@ -989,8 +1055,14 @@
       <w:numPr>
         <w:numId w:val="5"/>
       </w:numPr>
+      <w:spacing w:line="276" w:lineRule="auto" w:before="0" w:after="60"/>
       <w:contextualSpacing/>
     </w:pPr>
+    <w:rPr>
+      <w:rFonts w:ascii="Times New Roman" w:hAnsi="Times New Roman" w:eastAsia="Times New Roman" w:cs="Times New Roman"/>
+      <w:color w:val="000000"/>
+      <w:sz w:val="28"/>
+    </w:rPr>
   </w:style>
   <w:style w:type="paragraph" w:styleId="ListNumber2">
     <w:name w:val="List Number 2"/>
@@ -1002,8 +1074,14 @@
       <w:numPr>
         <w:numId w:val="6"/>
       </w:numPr>
+      <w:spacing w:line="276" w:lineRule="auto" w:before="0" w:after="60"/>
       <w:contextualSpacing/>
     </w:pPr>
+    <w:rPr>
+      <w:rFonts w:ascii="Times New Roman" w:hAnsi="Times New Roman" w:eastAsia="Times New Roman" w:cs="Times New Roman"/>
+      <w:color w:val="000000"/>
+      <w:sz w:val="28"/>
+    </w:rPr>
   </w:style>
   <w:style w:type="paragraph" w:styleId="ListNumber3">
     <w:name w:val="List Number 3"/>
@@ -1015,8 +1093,14 @@
       <w:numPr>
         <w:numId w:val="7"/>
       </w:numPr>
+      <w:spacing w:line="276" w:lineRule="auto" w:before="0" w:after="60"/>
       <w:contextualSpacing/>
     </w:pPr>
+    <w:rPr>
+      <w:rFonts w:ascii="Times New Roman" w:hAnsi="Times New Roman" w:eastAsia="Times New Roman" w:cs="Times New Roman"/>
+      <w:color w:val="000000"/>
+      <w:sz w:val="28"/>
+    </w:rPr>
   </w:style>
   <w:style w:type="paragraph" w:styleId="ListContinue">
     <w:name w:val="List Continue"/>
@@ -1025,10 +1109,15 @@
     <w:unhideWhenUsed/>
     <w:rsid w:val="0029639D"/>
     <w:pPr>
-      <w:spacing w:after="120"/>
+      <w:spacing w:after="60" w:line="276" w:lineRule="auto" w:before="0"/>
       <w:ind w:left="360"/>
       <w:contextualSpacing/>
     </w:pPr>
+    <w:rPr>
+      <w:rFonts w:ascii="Times New Roman" w:hAnsi="Times New Roman" w:eastAsia="Times New Roman" w:cs="Times New Roman"/>
+      <w:color w:val="000000"/>
+      <w:sz w:val="28"/>
+    </w:rPr>
   </w:style>
   <w:style w:type="paragraph" w:styleId="ListContinue2">
     <w:name w:val="List Continue 2"/>
@@ -1037,10 +1126,15 @@
     <w:unhideWhenUsed/>
     <w:rsid w:val="0029639D"/>
     <w:pPr>
-      <w:spacing w:after="120"/>
+      <w:spacing w:after="60" w:line="276" w:lineRule="auto" w:before="0"/>
       <w:ind w:left="720"/>
       <w:contextualSpacing/>
     </w:pPr>
+    <w:rPr>
+      <w:rFonts w:ascii="Times New Roman" w:hAnsi="Times New Roman" w:eastAsia="Times New Roman" w:cs="Times New Roman"/>
+      <w:color w:val="000000"/>
+      <w:sz w:val="28"/>
+    </w:rPr>
   </w:style>
   <w:style w:type="paragraph" w:styleId="ListContinue3">
     <w:name w:val="List Continue 3"/>
@@ -1049,10 +1143,15 @@
     <w:unhideWhenUsed/>
     <w:rsid w:val="0029639D"/>
     <w:pPr>
-      <w:spacing w:after="120"/>
+      <w:spacing w:after="60" w:line="276" w:lineRule="auto" w:before="0"/>
       <w:ind w:left="1080"/>
       <w:contextualSpacing/>
     </w:pPr>
+    <w:rPr>
+      <w:rFonts w:ascii="Times New Roman" w:hAnsi="Times New Roman" w:eastAsia="Times New Roman" w:cs="Times New Roman"/>
+      <w:color w:val="000000"/>
+      <w:sz w:val="28"/>
+    </w:rPr>
   </w:style>
   <w:style w:type="paragraph" w:styleId="MacroText">
     <w:name w:val="macro"/>
@@ -1070,10 +1169,12 @@
         <w:tab w:val="left" w:pos="3456"/>
         <w:tab w:val="left" w:pos="4032"/>
       </w:tabs>
+      <w:spacing w:line="276" w:lineRule="auto" w:before="0" w:after="60"/>
     </w:pPr>
     <w:rPr>
-      <w:rFonts w:ascii="Courier" w:hAnsi="Courier"/>
-      <w:sz w:val="20"/>
+      <w:rFonts w:ascii="Times New Roman" w:hAnsi="Times New Roman" w:eastAsia="Times New Roman" w:cs="Times New Roman"/>
+      <w:color w:val="000000"/>
+      <w:sz w:val="28"/>
       <w:szCs w:val="20"/>
     </w:rPr>
   </w:style>
@@ -1097,10 +1198,15 @@
     <w:uiPriority w:val="29"/>
     <w:qFormat/>
     <w:rsid w:val="00FC693F"/>
+    <w:pPr>
+      <w:spacing w:line="276" w:lineRule="auto" w:before="0" w:after="60"/>
+    </w:pPr>
     <w:rPr>
+      <w:rFonts w:ascii="Times New Roman" w:hAnsi="Times New Roman" w:eastAsia="Times New Roman" w:cs="Times New Roman"/>
       <w:i/>
       <w:iCs/>
-      <w:color w:val="000000" w:themeColor="text1"/>
+      <w:color w:val="000000"/>
+      <w:sz w:val="28"/>
     </w:rPr>
   </w:style>
   <w:style w:type="character" w:customStyle="1" w:styleId="QuoteChar">
@@ -1211,15 +1317,16 @@
     <w:qFormat/>
     <w:rsid w:val="00FC693F"/>
     <w:pPr>
-      <w:spacing w:line="360" w:lineRule="auto" w:after="120"/>
+      <w:keepNext w:val="0"/>
+      <w:spacing w:line="276" w:lineRule="auto" w:after="60" w:before="60"/>
       <w:ind w:firstLine="0"/>
       <w:jc w:val="center"/>
     </w:pPr>
     <w:rPr>
-      <w:rFonts w:ascii="Times New Roman" w:hAnsi="Times New Roman" w:eastAsia="Times New Roman"/>
+      <w:rFonts w:ascii="Times New Roman" w:hAnsi="Times New Roman" w:eastAsia="Times New Roman" w:cs="Times New Roman"/>
       <w:b/>
       <w:bCs/>
-      <w:color w:val="4F81BD" w:themeColor="accent1"/>
+      <w:color w:val="000000"/>
       <w:sz w:val="28"/>
       <w:szCs w:val="18"/>
     </w:rPr>
@@ -1258,15 +1365,17 @@
       <w:pBdr>
         <w:bottom w:val="single" w:sz="4" w:space="4" w:color="4F81BD" w:themeColor="accent1"/>
       </w:pBdr>
-      <w:spacing w:before="200" w:after="280"/>
+      <w:spacing w:before="0" w:after="60" w:line="276" w:lineRule="auto"/>
       <w:ind w:left="936" w:right="936"/>
     </w:pPr>
     <w:rPr>
+      <w:rFonts w:ascii="Times New Roman" w:hAnsi="Times New Roman" w:eastAsia="Times New Roman" w:cs="Times New Roman"/>
       <w:b/>
       <w:bCs/>
       <w:i/>
       <w:iCs/>
-      <w:color w:val="4F81BD" w:themeColor="accent1"/>
+      <w:color w:val="000000"/>
+      <w:sz w:val="28"/>
     </w:rPr>
   </w:style>
   <w:style w:type="character" w:customStyle="1" w:styleId="IntenseQuoteChar">
@@ -1359,13 +1468,14 @@
     <w:qFormat/>
     <w:rsid w:val="00FC693F"/>
     <w:pPr>
-      <w:spacing w:after="120" w:line="360" w:lineRule="auto"/>
+      <w:spacing w:after="60" w:line="276" w:lineRule="auto" w:before="0"/>
       <w:ind w:firstLine="0"/>
       <w:jc w:val="both"/>
       <w:outlineLvl w:val="9"/>
     </w:pPr>
     <w:rPr>
-      <w:rFonts w:ascii="Times New Roman" w:hAnsi="Times New Roman" w:eastAsia="Times New Roman"/>
+      <w:rFonts w:ascii="Times New Roman" w:hAnsi="Times New Roman" w:eastAsia="Times New Roman" w:cs="Times New Roman"/>
+      <w:color w:val="000000"/>
       <w:sz w:val="28"/>
     </w:rPr>
   </w:style>
@@ -12120,12 +12230,13 @@
     <w:name w:val="First Paragraph"/>
     <w:basedOn w:val="Normal"/>
     <w:pPr>
-      <w:spacing w:after="120" w:line="360" w:lineRule="auto"/>
+      <w:spacing w:after="60" w:line="360" w:lineRule="auto" w:before="0"/>
       <w:ind w:firstLine="709"/>
       <w:jc w:val="both"/>
     </w:pPr>
     <w:rPr>
-      <w:rFonts w:ascii="Times New Roman" w:hAnsi="Times New Roman" w:eastAsia="Times New Roman"/>
+      <w:rFonts w:ascii="Times New Roman" w:hAnsi="Times New Roman" w:eastAsia="Times New Roman" w:cs="Times New Roman"/>
+      <w:color w:val="000000"/>
       <w:sz w:val="28"/>
     </w:rPr>
   </w:style>
@@ -12133,12 +12244,13 @@
     <w:name w:val="Compact"/>
     <w:basedOn w:val="Normal"/>
     <w:pPr>
-      <w:spacing w:after="120" w:line="240" w:lineRule="auto"/>
+      <w:spacing w:after="0" w:line="276" w:lineRule="auto" w:before="0"/>
       <w:ind w:firstLine="0"/>
       <w:jc w:val="both"/>
     </w:pPr>
     <w:rPr>
-      <w:rFonts w:ascii="Times New Roman" w:hAnsi="Times New Roman" w:eastAsia="Times New Roman"/>
+      <w:rFonts w:ascii="Times New Roman" w:hAnsi="Times New Roman" w:eastAsia="Times New Roman" w:cs="Times New Roman"/>
+      <w:color w:val="000000"/>
       <w:sz w:val="28"/>
     </w:rPr>
   </w:style>
@@ -12146,12 +12258,14 @@
     <w:name w:val="Table Caption"/>
     <w:basedOn w:val="Normal"/>
     <w:pPr>
-      <w:spacing w:after="120" w:line="360" w:lineRule="auto"/>
+      <w:keepNext/>
+      <w:spacing w:after="60" w:line="276" w:lineRule="auto" w:before="60"/>
       <w:ind w:firstLine="0"/>
       <w:jc w:val="center"/>
     </w:pPr>
     <w:rPr>
-      <w:rFonts w:ascii="Times New Roman" w:hAnsi="Times New Roman" w:eastAsia="Times New Roman"/>
+      <w:rFonts w:ascii="Times New Roman" w:hAnsi="Times New Roman" w:eastAsia="Times New Roman" w:cs="Times New Roman"/>
+      <w:color w:val="000000"/>
       <w:sz w:val="28"/>
     </w:rPr>
   </w:style>
@@ -12159,12 +12273,14 @@
     <w:name w:val="Image Caption"/>
     <w:basedOn w:val="Normal"/>
     <w:pPr>
-      <w:spacing w:after="120" w:line="360" w:lineRule="auto"/>
+      <w:keepNext w:val="0"/>
+      <w:spacing w:after="60" w:line="276" w:lineRule="auto" w:before="60"/>
       <w:ind w:firstLine="0"/>
       <w:jc w:val="center"/>
     </w:pPr>
     <w:rPr>
-      <w:rFonts w:ascii="Times New Roman" w:hAnsi="Times New Roman" w:eastAsia="Times New Roman"/>
+      <w:rFonts w:ascii="Times New Roman" w:hAnsi="Times New Roman" w:eastAsia="Times New Roman" w:cs="Times New Roman"/>
+      <w:color w:val="000000"/>
       <w:sz w:val="28"/>
     </w:rPr>
   </w:style>

</xml_diff>